<commit_message>
Add Zenodo DOI to README, paper Declarations
Zenodo DOI minted: 10.5281/zenodo.19767696 (v0.9)
Concept DOI: 10.5281/zenodo.19767695
</commit_message>
<xml_diff>
--- a/paper/paper_v09.docx
+++ b/paper/paper_v09.docx
@@ -3474,7 +3474,30 @@
         <w:t xml:space="preserve"> </w:t>
       </w:r>
       <w:r>
-        <w:t xml:space="preserve">is the persona baseline value (the starting-point text a pipeline attempts to modify; see §4.1 for the persona’s design). A score of 1.0 indicates perfect convergence to the human population mean; 0.0 indicates no movement from baseline; negative values indicate movement away from human. Note that convergence to human statistical means is not the same as reader-perceived quality (§5.5.7); R_m measures the former only.</w:t>
+        <w:t xml:space="preserve">is the persona baseline value (the starting-point text a pipeline attempts to modify; see §4.1 for the persona’s design). A score of 1.0 indicates perfect convergence to the human population mean; 0.0 indicates no movement from baseline; negative values indicate movement away from human. Note that convergence to human statistical means is not the same as reader-perceived quality (§5.5.7);</w:t>
+      </w:r>
+      <w:r>
+        <w:t xml:space="preserve"> </w:t>
+      </w:r>
+      <m:oMath>
+        <m:sSub>
+          <m:e>
+            <m:r>
+              <m:t>R</m:t>
+            </m:r>
+          </m:e>
+          <m:sub>
+            <m:r>
+              <m:t>m</m:t>
+            </m:r>
+          </m:sub>
+        </m:sSub>
+      </m:oMath>
+      <w:r>
+        <w:t xml:space="preserve"> </w:t>
+      </w:r>
+      <w:r>
+        <w:t xml:space="preserve">measures the former only.</w:t>
       </w:r>
     </w:p>
     <w:bookmarkEnd w:id="32"/>
@@ -14236,7 +14259,7 @@
       </w:r>
     </w:p>
     <w:bookmarkEnd w:id="77"/>
-    <w:bookmarkStart w:id="85" w:name="declarations"/>
+    <w:bookmarkStart w:id="88" w:name="declarations"/>
     <w:p>
       <w:pPr>
         <w:pStyle w:val="Heading1"/>
@@ -14336,7 +14359,7 @@
       </w:r>
     </w:p>
     <w:bookmarkEnd w:id="78"/>
-    <w:bookmarkStart w:id="79" w:name="data-availability"/>
+    <w:bookmarkStart w:id="82" w:name="data-availability"/>
     <w:p>
       <w:pPr>
         <w:pStyle w:val="Heading2"/>
@@ -14500,11 +14523,59 @@
         <w:pStyle w:val="FirstParagraph"/>
       </w:pPr>
       <w:r>
-        <w:t xml:space="preserve">Release channel: public GitHub repository with permanent Zenodo DOI archival at the time of publication. License: CC-BY 4.0 for data and text artifacts; MIT for code (see next).</w:t>
-      </w:r>
-    </w:p>
-    <w:bookmarkEnd w:id="79"/>
-    <w:bookmarkStart w:id="80" w:name="code-availability"/>
+        <w:t xml:space="preserve">Release channel: public GitHub repository at</w:t>
+      </w:r>
+      <w:r>
+        <w:t xml:space="preserve"> </w:t>
+      </w:r>
+      <w:hyperlink r:id="rId79">
+        <w:r>
+          <w:rPr>
+            <w:rStyle w:val="Hyperlink"/>
+          </w:rPr>
+          <w:t xml:space="preserve">https://github.com/lance-a-diamond/detector-paradox</w:t>
+        </w:r>
+      </w:hyperlink>
+      <w:r>
+        <w:t xml:space="preserve">, archived at Zenodo with DOI</w:t>
+      </w:r>
+      <w:r>
+        <w:t xml:space="preserve"> </w:t>
+      </w:r>
+      <w:hyperlink r:id="rId80">
+        <w:r>
+          <w:rPr>
+            <w:rStyle w:val="Hyperlink"/>
+          </w:rPr>
+          <w:t xml:space="preserve">10.5281/zenodo.19767696</w:t>
+        </w:r>
+      </w:hyperlink>
+      <w:r>
+        <w:t xml:space="preserve"> </w:t>
+      </w:r>
+      <w:r>
+        <w:t xml:space="preserve">(version-specific) and concept DOI</w:t>
+      </w:r>
+      <w:r>
+        <w:t xml:space="preserve"> </w:t>
+      </w:r>
+      <w:hyperlink r:id="rId81">
+        <w:r>
+          <w:rPr>
+            <w:rStyle w:val="Hyperlink"/>
+          </w:rPr>
+          <w:t xml:space="preserve">10.5281/zenodo.19767695</w:t>
+        </w:r>
+      </w:hyperlink>
+      <w:r>
+        <w:t xml:space="preserve"> </w:t>
+      </w:r>
+      <w:r>
+        <w:t xml:space="preserve">(always-newest). License: CC-BY 4.0 for data and text artifacts; MIT for code (see next).</w:t>
+      </w:r>
+    </w:p>
+    <w:bookmarkEnd w:id="82"/>
+    <w:bookmarkStart w:id="83" w:name="code-availability"/>
     <w:p>
       <w:pPr>
         <w:pStyle w:val="Heading2"/>
@@ -14723,8 +14794,8 @@
         <w:t xml:space="preserve">License: MIT.</w:t>
       </w:r>
     </w:p>
-    <w:bookmarkEnd w:id="80"/>
-    <w:bookmarkStart w:id="81" w:name="Xffeb602eab7edbe6165718b818a10e64d573ed2"/>
+    <w:bookmarkEnd w:id="83"/>
+    <w:bookmarkStart w:id="84" w:name="Xffeb602eab7edbe6165718b818a10e64d573ed2"/>
     <w:p>
       <w:pPr>
         <w:pStyle w:val="Heading2"/>
@@ -14804,8 +14875,8 @@
         <w:t xml:space="preserve">No other competing interests to declare.</w:t>
       </w:r>
     </w:p>
-    <w:bookmarkEnd w:id="81"/>
-    <w:bookmarkStart w:id="82" w:name="X77508d35f244f2a00983f66fb0eae39c1974708"/>
+    <w:bookmarkEnd w:id="84"/>
+    <w:bookmarkStart w:id="85" w:name="X77508d35f244f2a00983f66fb0eae39c1974708"/>
     <w:p>
       <w:pPr>
         <w:pStyle w:val="Heading2"/>
@@ -14843,8 +14914,8 @@
         <w:t xml:space="preserve">). All scientific claims, experimental design choices, and interpretations are the author’s own and were verified against the underlying data before inclusion.</w:t>
       </w:r>
     </w:p>
-    <w:bookmarkEnd w:id="82"/>
-    <w:bookmarkStart w:id="83" w:name="potential-risks-and-responsible-use"/>
+    <w:bookmarkEnd w:id="85"/>
+    <w:bookmarkStart w:id="86" w:name="potential-risks-and-responsible-use"/>
     <w:p>
       <w:pPr>
         <w:pStyle w:val="Heading2"/>
@@ -14888,8 +14959,8 @@
         <w:t xml:space="preserve">content is unlikely to improve the text as experienced by its intended audience.</w:t>
       </w:r>
     </w:p>
-    <w:bookmarkEnd w:id="83"/>
-    <w:bookmarkStart w:id="84" w:name="X7299b83b0100eab33d4adb8d11f91a3acb18e32"/>
+    <w:bookmarkEnd w:id="86"/>
+    <w:bookmarkStart w:id="87" w:name="X7299b83b0100eab33d4adb8d11f91a3acb18e32"/>
     <w:p>
       <w:pPr>
         <w:pStyle w:val="Heading2"/>
@@ -14996,9 +15067,9 @@
         <w:t xml:space="preserve">: None. The analysis reported here follows the pre-registered protocol without post-hoc filter adjustment. The n = 43 unfiltered cohort is reported as a sensitivity check in Appendix C.1 rather than as the primary analysis. A secondary n = 30 top-quality-filter cohort (not pre-registered) is noted in Appendix C.2 for completeness but is not used for any reported headline claim; the Persona-vs-humanized Fisher’s p = 0.036 finding that would emerge only under the n = 30 filter is reported transparently as filter-dependent and not claimed as a primary result.</w:t>
       </w:r>
     </w:p>
-    <w:bookmarkEnd w:id="84"/>
-    <w:bookmarkEnd w:id="85"/>
-    <w:bookmarkStart w:id="97" w:name="appendix-a-metric-definitions"/>
+    <w:bookmarkEnd w:id="87"/>
+    <w:bookmarkEnd w:id="88"/>
+    <w:bookmarkStart w:id="100" w:name="appendix-a-metric-definitions"/>
     <w:p>
       <w:pPr>
         <w:pStyle w:val="Heading1"/>
@@ -15123,7 +15194,7 @@
         <w:t xml:space="preserve">. Per-1k rates are computed as (count × 1000) / word_count. All source code is released in the paper’s companion repository.</w:t>
       </w:r>
     </w:p>
-    <w:bookmarkStart w:id="91" w:name="a.1-linguistic-battery-22-metrics"/>
+    <w:bookmarkStart w:id="94" w:name="a.1-linguistic-battery-22-metrics"/>
     <w:p>
       <w:pPr>
         <w:pStyle w:val="Heading2"/>
@@ -15141,7 +15212,7 @@
         <w:t xml:space="preserve">A.1 Linguistic battery (22 metrics)</w:t>
       </w:r>
     </w:p>
-    <w:bookmarkStart w:id="86" w:name="voice-and-person-4-metrics"/>
+    <w:bookmarkStart w:id="89" w:name="voice-and-person-4-metrics"/>
     <w:p>
       <w:pPr>
         <w:pStyle w:val="Heading3"/>
@@ -15283,8 +15354,8 @@
         <w:t xml:space="preserve">): count of apostrophe-containing clitic contractions (’s, n’t, ’ll, ’ve, ’re, ’d, ’m), normalized to per-1000-word rate.</w:t>
       </w:r>
     </w:p>
-    <w:bookmarkEnd w:id="86"/>
-    <w:bookmarkStart w:id="87" w:name="readability-and-structure-5-metrics"/>
+    <w:bookmarkEnd w:id="89"/>
+    <w:bookmarkStart w:id="90" w:name="readability-and-structure-5-metrics"/>
     <w:p>
       <w:pPr>
         <w:pStyle w:val="Heading3"/>
@@ -15433,8 +15504,8 @@
         <w:t xml:space="preserve">): fraction of sentences with more than 35 tokens, expressed as a percentage.</w:t>
       </w:r>
     </w:p>
-    <w:bookmarkEnd w:id="87"/>
-    <w:bookmarkStart w:id="88" w:name="lexical-diversity-3-metrics"/>
+    <w:bookmarkEnd w:id="90"/>
+    <w:bookmarkStart w:id="91" w:name="lexical-diversity-3-metrics"/>
     <w:p>
       <w:pPr>
         <w:pStyle w:val="Heading3"/>
@@ -15533,8 +15604,8 @@
         <w:t xml:space="preserve">: fraction of word types that appear exactly once in the sample. Computed as count of hapaxes divided by vocabulary size (unique types).</w:t>
       </w:r>
     </w:p>
-    <w:bookmarkEnd w:id="88"/>
-    <w:bookmarkStart w:id="89" w:name="discourse-markers-5-metrics"/>
+    <w:bookmarkEnd w:id="91"/>
+    <w:bookmarkStart w:id="92" w:name="discourse-markers-5-metrics"/>
     <w:p>
       <w:pPr>
         <w:pStyle w:val="Heading3"/>
@@ -15740,8 +15811,8 @@
         <w:t xml:space="preserve">): count of quotation-mark pairs (straight or curly), normalized to per-1000-word rate.</w:t>
       </w:r>
     </w:p>
-    <w:bookmarkEnd w:id="89"/>
-    <w:bookmarkStart w:id="90" w:name="quality-signals-5-metrics"/>
+    <w:bookmarkEnd w:id="92"/>
+    <w:bookmarkStart w:id="93" w:name="quality-signals-5-metrics"/>
     <w:p>
       <w:pPr>
         <w:pStyle w:val="Heading3"/>
@@ -16073,9 +16144,9 @@
         <w:t xml:space="preserve">), normalized to per-1000-word rate. A subcomponent of metric 18 that we break out separately because it is the single strongest phrase-level discriminator in the literature (Pangram reports these phrases appear 70–700× more often in LLM outputs than in human text).</w:t>
       </w:r>
     </w:p>
-    <w:bookmarkEnd w:id="90"/>
-    <w:bookmarkEnd w:id="91"/>
-    <w:bookmarkStart w:id="96" w:name="X0fb5a5d9b782f88b004f12431419790e3ed2bae"/>
+    <w:bookmarkEnd w:id="93"/>
+    <w:bookmarkEnd w:id="94"/>
+    <w:bookmarkStart w:id="99" w:name="X0fb5a5d9b782f88b004f12431419790e3ed2bae"/>
     <w:p>
       <w:pPr>
         <w:pStyle w:val="Heading2"/>
@@ -16116,7 +16187,7 @@
         <w:t xml:space="preserve">(Reimers and Gurevych, 2019). Each sentence is encoded to a 768-dim unit vector; metrics below are computed on those vectors.</w:t>
       </w:r>
     </w:p>
-    <w:bookmarkStart w:id="92" w:name="redundancy-2-metrics"/>
+    <w:bookmarkStart w:id="95" w:name="redundancy-2-metrics"/>
     <w:p>
       <w:pPr>
         <w:pStyle w:val="Heading3"/>
@@ -16196,8 +16267,8 @@
         <w:t xml:space="preserve">): maximum pairwise cosine similarity across all sentence pairs. Captures the strongest single repetition in the text.</w:t>
       </w:r>
     </w:p>
-    <w:bookmarkEnd w:id="92"/>
-    <w:bookmarkStart w:id="93" w:name="consecutive-similarity-2-metrics"/>
+    <w:bookmarkEnd w:id="95"/>
+    <w:bookmarkStart w:id="96" w:name="consecutive-similarity-2-metrics"/>
     <w:p>
       <w:pPr>
         <w:pStyle w:val="Heading3"/>
@@ -16306,8 +16377,8 @@
         <w:t xml:space="preserve">): standard deviation of adjacent-pair cosine similarity. Human writing exhibits higher std (topic shifts, asides); AI text tends toward lower std (uniform flow).</w:t>
       </w:r>
     </w:p>
-    <w:bookmarkEnd w:id="93"/>
-    <w:bookmarkStart w:id="94" w:name="content-diversity-variance-1-metric"/>
+    <w:bookmarkEnd w:id="96"/>
+    <w:bookmarkStart w:id="97" w:name="content-diversity-variance-1-metric"/>
     <w:p>
       <w:pPr>
         <w:pStyle w:val="Heading3"/>
@@ -16356,8 +16427,8 @@
         <w:t xml:space="preserve">): per-paragraph content diversity, computed as the mean pairwise Euclidean distance between sentence embeddings within a paragraph, then the variance of that mean across paragraphs. Human writing tends to show higher density variance (technical paragraphs alternate with narrative ones); aligned AI pipelines converge on lower variance. The strongest single linguistic discriminator between AI and human writing in our corpus (§5.2).</w:t>
       </w:r>
     </w:p>
-    <w:bookmarkEnd w:id="94"/>
-    <w:bookmarkStart w:id="95" w:name="embedding-transition-variance-1-metric"/>
+    <w:bookmarkEnd w:id="97"/>
+    <w:bookmarkStart w:id="98" w:name="embedding-transition-variance-1-metric"/>
     <w:p>
       <w:pPr>
         <w:pStyle w:val="Heading3"/>
@@ -16406,10 +16477,10 @@
         <w:t xml:space="preserve">): variance of the Euclidean distance between consecutive sentence embeddings. High variance indicates a mixture of predictable transitions and surprising topic shifts, characteristic of human writing.</w:t>
       </w:r>
     </w:p>
-    <w:bookmarkEnd w:id="95"/>
-    <w:bookmarkEnd w:id="96"/>
-    <w:bookmarkEnd w:id="97"/>
-    <w:bookmarkStart w:id="105" w:name="appendix-b-human-evaluation-instrument"/>
+    <w:bookmarkEnd w:id="98"/>
+    <w:bookmarkEnd w:id="99"/>
+    <w:bookmarkEnd w:id="100"/>
+    <w:bookmarkStart w:id="108" w:name="appendix-b-human-evaluation-instrument"/>
     <w:p>
       <w:pPr>
         <w:pStyle w:val="Heading1"/>
@@ -16489,7 +16560,7 @@
         <w:t xml:space="preserve">handles API endpoints and response storage).</w:t>
       </w:r>
     </w:p>
-    <w:bookmarkStart w:id="98" w:name="b.1-survey-flow"/>
+    <w:bookmarkStart w:id="101" w:name="b.1-survey-flow"/>
     <w:p>
       <w:pPr>
         <w:pStyle w:val="Heading2"/>
@@ -16665,8 +16736,8 @@
         <w:t xml:space="preserve">— Prolific completion code + submission confirmation.</w:t>
       </w:r>
     </w:p>
-    <w:bookmarkEnd w:id="98"/>
-    <w:bookmarkStart w:id="99" w:name="b.2-passage-selection"/>
+    <w:bookmarkEnd w:id="101"/>
+    <w:bookmarkStart w:id="102" w:name="b.2-passage-selection"/>
     <w:p>
       <w:pPr>
         <w:pStyle w:val="Heading2"/>
@@ -17168,8 +17239,8 @@
         <w:t xml:space="preserve">Passages were truncated to approximately 800 words each (range 720–910) at natural section boundaries. Passage C and Passage H share a topic (idempotency keys) at opposite ends of the pipeline; Passage D and Passage E share a topic (exponential backoff) across the human-vs-AI axis at the final pipeline stage. All three human baselines were selected to predate widespread LLM adoption (2015–2017 publication dates) to minimize detector cache-pollution risk (see the feedback rule in our public release on AI detector retrieval-not-classification behavior).</w:t>
       </w:r>
     </w:p>
-    <w:bookmarkEnd w:id="99"/>
-    <w:bookmarkStart w:id="100" w:name="b.3-per-passage-questions"/>
+    <w:bookmarkEnd w:id="102"/>
+    <w:bookmarkStart w:id="103" w:name="b.3-per-passage-questions"/>
     <w:p>
       <w:pPr>
         <w:pStyle w:val="Heading2"/>
@@ -17499,8 +17570,8 @@
         <w:t xml:space="preserve">The six Likert items (Q2–Q7) compose the Likert battery used for composite quality (Q3–Q5, Q7 averaged) and per-dimension tests (§5.5.4). Q1 provides the binary classification analyzed in §5.5.1–5.5.3. Q8 free-text responses are thematically coded for the reader-cited-features analysis (§5.5.5).</w:t>
       </w:r>
     </w:p>
-    <w:bookmarkEnd w:id="100"/>
-    <w:bookmarkStart w:id="101" w:name="b.4-randomization"/>
+    <w:bookmarkEnd w:id="103"/>
+    <w:bookmarkStart w:id="104" w:name="b.4-randomization"/>
     <w:p>
       <w:pPr>
         <w:pStyle w:val="Heading2"/>
@@ -17541,8 +17612,8 @@
         <w:t xml:space="preserve">at session start. Within each passage page, question order is fixed (Q1–Q8) across participants. No per-participant randomization of Likert anchor order or polarity was applied; all scales are oriented so that 5 is the more favorable pole.</w:t>
       </w:r>
     </w:p>
-    <w:bookmarkEnd w:id="101"/>
-    <w:bookmarkStart w:id="102" w:name="b.5-attention-checks-and-exclusion"/>
+    <w:bookmarkEnd w:id="104"/>
+    <w:bookmarkStart w:id="105" w:name="b.5-attention-checks-and-exclusion"/>
     <w:p>
       <w:pPr>
         <w:pStyle w:val="Heading2"/>
@@ -17601,8 +17672,8 @@
         <w:t xml:space="preserve">gear rather than reading for comprehension — are excluded from the primary analysis. Ten of 43 participants met this criterion; the retained n = 33 cohort is the primary analysis sample. The unfiltered n = 43 cohort is reported as a sensitivity check in Appendix C.1.</w:t>
       </w:r>
     </w:p>
-    <w:bookmarkEnd w:id="102"/>
-    <w:bookmarkStart w:id="103" w:name="b.6-debrief"/>
+    <w:bookmarkEnd w:id="105"/>
+    <w:bookmarkStart w:id="106" w:name="b.6-debrief"/>
     <w:p>
       <w:pPr>
         <w:pStyle w:val="Heading2"/>
@@ -17750,8 +17821,8 @@
         <w:t xml:space="preserve">question analyzed in §5.5.4 binds readers to one choice among the five AI passages and is used to test the aggregate preference reported there (16 of 33 = 48.5% selecting an AI passage, p = 0.107 below a 62.5% base rate).</w:t>
       </w:r>
     </w:p>
-    <w:bookmarkEnd w:id="103"/>
-    <w:bookmarkStart w:id="104" w:name="b.7-compensation-and-participant-flow"/>
+    <w:bookmarkEnd w:id="106"/>
+    <w:bookmarkStart w:id="107" w:name="b.7-compensation-and-participant-flow"/>
     <w:p>
       <w:pPr>
         <w:pStyle w:val="Heading2"/>
@@ -17792,9 +17863,9 @@
         <w:t xml:space="preserve">with Prolific PIDs replaced by randomized session identifiers.</w:t>
       </w:r>
     </w:p>
-    <w:bookmarkEnd w:id="104"/>
-    <w:bookmarkEnd w:id="105"/>
-    <w:bookmarkStart w:id="108" w:name="appendix-c-sensitivity-analyses"/>
+    <w:bookmarkEnd w:id="107"/>
+    <w:bookmarkEnd w:id="108"/>
+    <w:bookmarkStart w:id="111" w:name="appendix-c-sensitivity-analyses"/>
     <w:p>
       <w:pPr>
         <w:pStyle w:val="Heading1"/>
@@ -17812,7 +17883,7 @@
         <w:t xml:space="preserve">Appendix C: Sensitivity Analyses</w:t>
       </w:r>
     </w:p>
-    <w:bookmarkStart w:id="106" w:name="Xc6082b805ac413a467f9e79b793cc6deb94e590"/>
+    <w:bookmarkStart w:id="109" w:name="Xc6082b805ac413a467f9e79b793cc6deb94e590"/>
     <w:p>
       <w:pPr>
         <w:pStyle w:val="Heading2"/>
@@ -18491,8 +18562,8 @@
         <w:t xml:space="preserve">) holds under either filter.</w:t>
       </w:r>
     </w:p>
-    <w:bookmarkEnd w:id="106"/>
-    <w:bookmarkStart w:id="107" w:name="X32369f3ea4630cad2ccf4484c0f66f94f7adcd3"/>
+    <w:bookmarkEnd w:id="109"/>
+    <w:bookmarkStart w:id="110" w:name="X32369f3ea4630cad2ccf4484c0f66f94f7adcd3"/>
     <w:p>
       <w:pPr>
         <w:pStyle w:val="Heading2"/>
@@ -18518,9 +18589,9 @@
         <w:t xml:space="preserve">For completeness we also report results on the top 30 responses by a composite quality score combining total duration, per-passage reading time, Likert variance, reasoning engagement, and origin-guess variety. This is a post-hoc, not pre-registered, filter. All primary effects again hold in direction and significance level; the Copyleaks-ρ anti-correlation on AI passages reaches ρ = −0.92 (p = 0.026) under this stricter filter, providing the strongest signal for the machine-crowd disagreement result. We report the pre-registered n = 33 analysis as primary to avoid any appearance of filter selection after observing the effects; the top-30 cohort is reported here as secondary evidence that the direction of findings is robust to filter choice.</w:t>
       </w:r>
     </w:p>
-    <w:bookmarkEnd w:id="107"/>
-    <w:bookmarkEnd w:id="108"/>
-    <w:bookmarkStart w:id="113" w:name="appendix-d-glossary"/>
+    <w:bookmarkEnd w:id="110"/>
+    <w:bookmarkEnd w:id="111"/>
+    <w:bookmarkStart w:id="116" w:name="appendix-d-glossary"/>
     <w:p>
       <w:pPr>
         <w:pStyle w:val="Heading1"/>
@@ -18546,7 +18617,7 @@
         <w:t xml:space="preserve">Terms are grouped by scope; entries cover paper-specific usage rather than re-deriving well-known definitions.</w:t>
       </w:r>
     </w:p>
-    <w:bookmarkStart w:id="109" w:name="d.1-corpus-and-pipeline"/>
+    <w:bookmarkStart w:id="112" w:name="d.1-corpus-and-pipeline"/>
     <w:p>
       <w:pPr>
         <w:pStyle w:val="Heading2"/>
@@ -18764,8 +18835,8 @@
         <w:t xml:space="preserve">: Dana → surgical v10.2 → cross-model v2, applied in order. We also report each stage as a standalone sample group for ablation.</w:t>
       </w:r>
     </w:p>
-    <w:bookmarkEnd w:id="109"/>
-    <w:bookmarkStart w:id="110" w:name="d.2-measurement-framework"/>
+    <w:bookmarkEnd w:id="112"/>
+    <w:bookmarkStart w:id="113" w:name="d.2-measurement-framework"/>
     <w:p>
       <w:pPr>
         <w:pStyle w:val="Heading2"/>
@@ -18952,8 +19023,8 @@
         <w:t xml:space="preserve">): a detector’s response to the characteristic token-selection pattern that arises from LLM text generation, independent of surface linguistic statistics. Binoculars responds to this signal most directly (via a perplexity ratio between a base and instruction-tuned LM); GPTZero and Copyleaks weight it significantly as part of hybrid approaches. Defeating it requires disrupting the single-model distribution, which cross-model v2 sentence mixing does.</w:t>
       </w:r>
     </w:p>
-    <w:bookmarkEnd w:id="110"/>
-    <w:bookmarkStart w:id="111" w:name="d.3-reader-evaluation"/>
+    <w:bookmarkEnd w:id="113"/>
+    <w:bookmarkStart w:id="114" w:name="d.3-reader-evaluation"/>
     <w:p>
       <w:pPr>
         <w:pStyle w:val="Heading2"/>
@@ -19139,8 +19210,8 @@
         <w:t xml:space="preserve">: linguistic-feature densities that exceed human-corpus norms. At the Passage-H level, first-person singular reaches 19.20/1k — 4.5× the human corpus mean (4.26/1k), 2.0× the corpus-level human maximum (Srivastav 9.39/1k), and 3.6× the highest of the three human baselines in the survey (Olah 5.38/1k). At the Dana group level, the average FPS is 16.68/1k, ≈ 4× the human corpus mean; contractions average 27.14/1k, 2.4× the human corpus mean. §5.5.8 shows readers rate supra-human densities higher in quality than human-normal densities.</w:t>
       </w:r>
     </w:p>
-    <w:bookmarkEnd w:id="111"/>
-    <w:bookmarkStart w:id="112" w:name="d.4-statistical-conventions"/>
+    <w:bookmarkEnd w:id="114"/>
+    <w:bookmarkStart w:id="115" w:name="d.4-statistical-conventions"/>
     <w:p>
       <w:pPr>
         <w:pStyle w:val="Heading2"/>
@@ -19268,9 +19339,9 @@
         <w:t xml:space="preserve">: the primary-analysis cohort after applying the reading-rate exclusion. Unfiltered n = 43 is reported as a sensitivity check (Appendix C.1); post-hoc top-30 quality-filtered results appear in Appendix C.2.</w:t>
       </w:r>
     </w:p>
-    <w:bookmarkEnd w:id="112"/>
-    <w:bookmarkEnd w:id="113"/>
-    <w:bookmarkStart w:id="118" w:name="appendix-e-reproducibility-checklist"/>
+    <w:bookmarkEnd w:id="115"/>
+    <w:bookmarkEnd w:id="116"/>
+    <w:bookmarkStart w:id="121" w:name="appendix-e-reproducibility-checklist"/>
     <w:p>
       <w:pPr>
         <w:pStyle w:val="Heading1"/>
@@ -19296,7 +19367,7 @@
         <w:t xml:space="preserve">This checklist follows the ACL Responsible NLP Checklist categories. Section references point to the authoritative source for each item within this paper.</w:t>
       </w:r>
     </w:p>
-    <w:bookmarkStart w:id="114" w:name="e.1-every-submission"/>
+    <w:bookmarkStart w:id="117" w:name="e.1-every-submission"/>
     <w:p>
       <w:pPr>
         <w:pStyle w:val="Heading2"/>
@@ -19416,8 +19487,8 @@
         <w:t xml:space="preserve">(Declarations).</w:t>
       </w:r>
     </w:p>
-    <w:bookmarkEnd w:id="114"/>
-    <w:bookmarkStart w:id="115" w:name="e.2-artifacts-used-or-created"/>
+    <w:bookmarkEnd w:id="117"/>
+    <w:bookmarkStart w:id="118" w:name="e.2-artifacts-used-or-created"/>
     <w:p>
       <w:pPr>
         <w:pStyle w:val="Heading2"/>
@@ -19699,8 +19770,8 @@
         <w:t xml:space="preserve">, Declarations).</w:t>
       </w:r>
     </w:p>
-    <w:bookmarkEnd w:id="115"/>
-    <w:bookmarkStart w:id="116" w:name="e.3-computational-experiments"/>
+    <w:bookmarkEnd w:id="118"/>
+    <w:bookmarkStart w:id="119" w:name="e.3-computational-experiments"/>
     <w:p>
       <w:pPr>
         <w:pStyle w:val="Heading2"/>
@@ -19862,8 +19933,8 @@
         <w:t xml:space="preserve">— All reported point estimates include confidence intervals or p-values where applicable; per-dimension Likert contrasts are corrected for multiple comparisons via Benjamini–Hochberg FDR (§5.5.4, Appendix D.4).</w:t>
       </w:r>
     </w:p>
-    <w:bookmarkEnd w:id="116"/>
-    <w:bookmarkStart w:id="117" w:name="e.4-human-subjects"/>
+    <w:bookmarkEnd w:id="119"/>
+    <w:bookmarkStart w:id="120" w:name="e.4-human-subjects"/>
     <w:p>
       <w:pPr>
         <w:pStyle w:val="Heading2"/>
@@ -20057,8 +20128,8 @@
         <w:t xml:space="preserve">, Declarations). Moderator analyses by demographic stratum are flagged as underpowered at n = 33 (§6.4 Limitations).</w:t>
       </w:r>
     </w:p>
-    <w:bookmarkEnd w:id="117"/>
-    <w:bookmarkEnd w:id="118"/>
+    <w:bookmarkEnd w:id="120"/>
+    <w:bookmarkEnd w:id="121"/>
     <w:sectPr/>
   </w:body>
 </w:document>

</xml_diff>

<commit_message>
Add ORCID to Author info in Declarations
ORCID iD 0009-0004-9691-4997 (https://orcid.org/0009-0004-9691-4997)
linked at arXiv account level on 2026-04-25; now embedded in the
paper Declarations as well.
</commit_message>
<xml_diff>
--- a/paper/paper_v09.docx
+++ b/paper/paper_v09.docx
@@ -14259,7 +14259,7 @@
       </w:r>
     </w:p>
     <w:bookmarkEnd w:id="77"/>
-    <w:bookmarkStart w:id="88" w:name="declarations"/>
+    <w:bookmarkStart w:id="89" w:name="declarations"/>
     <w:p>
       <w:pPr>
         <w:pStyle w:val="Heading1"/>
@@ -14795,7 +14795,7 @@
       </w:r>
     </w:p>
     <w:bookmarkEnd w:id="83"/>
-    <w:bookmarkStart w:id="84" w:name="Xffeb602eab7edbe6165718b818a10e64d573ed2"/>
+    <w:bookmarkStart w:id="85" w:name="Xffeb602eab7edbe6165718b818a10e64d573ed2"/>
     <w:p>
       <w:pPr>
         <w:pStyle w:val="Heading2"/>
@@ -14818,7 +14818,18 @@
         <w:pStyle w:val="FirstParagraph"/>
       </w:pPr>
       <w:r>
-        <w:t xml:space="preserve">Lance Diamond is an independent researcher developing Scribe, a commercial AI text generation product. The research described in this paper emerged from engineering problems encountered during Scribe’s development — specifically, the gap between detector-evasion performance and reader-perceived quality observed in the product’s humanization pipelines. This study was entirely self-funded.</w:t>
+        <w:t xml:space="preserve">Lance Diamond (</w:t>
+      </w:r>
+      <w:hyperlink r:id="rId84">
+        <w:r>
+          <w:rPr>
+            <w:rStyle w:val="Hyperlink"/>
+          </w:rPr>
+          <w:t xml:space="preserve">ORCID 0009-0004-9691-4997</w:t>
+        </w:r>
+      </w:hyperlink>
+      <w:r>
+        <w:t xml:space="preserve">) is an independent researcher developing Scribe, a commercial AI text generation product. The research described in this paper emerged from engineering problems encountered during Scribe’s development — specifically, the gap between detector-evasion performance and reader-perceived quality observed in the product’s humanization pipelines. This study was entirely self-funded.</w:t>
       </w:r>
     </w:p>
     <w:p>
@@ -14875,8 +14886,8 @@
         <w:t xml:space="preserve">No other competing interests to declare.</w:t>
       </w:r>
     </w:p>
-    <w:bookmarkEnd w:id="84"/>
-    <w:bookmarkStart w:id="85" w:name="X77508d35f244f2a00983f66fb0eae39c1974708"/>
+    <w:bookmarkEnd w:id="85"/>
+    <w:bookmarkStart w:id="86" w:name="X77508d35f244f2a00983f66fb0eae39c1974708"/>
     <w:p>
       <w:pPr>
         <w:pStyle w:val="Heading2"/>
@@ -14914,8 +14925,8 @@
         <w:t xml:space="preserve">). All scientific claims, experimental design choices, and interpretations are the author’s own and were verified against the underlying data before inclusion.</w:t>
       </w:r>
     </w:p>
-    <w:bookmarkEnd w:id="85"/>
-    <w:bookmarkStart w:id="86" w:name="potential-risks-and-responsible-use"/>
+    <w:bookmarkEnd w:id="86"/>
+    <w:bookmarkStart w:id="87" w:name="potential-risks-and-responsible-use"/>
     <w:p>
       <w:pPr>
         <w:pStyle w:val="Heading2"/>
@@ -14959,8 +14970,8 @@
         <w:t xml:space="preserve">content is unlikely to improve the text as experienced by its intended audience.</w:t>
       </w:r>
     </w:p>
-    <w:bookmarkEnd w:id="86"/>
-    <w:bookmarkStart w:id="87" w:name="X7299b83b0100eab33d4adb8d11f91a3acb18e32"/>
+    <w:bookmarkEnd w:id="87"/>
+    <w:bookmarkStart w:id="88" w:name="X7299b83b0100eab33d4adb8d11f91a3acb18e32"/>
     <w:p>
       <w:pPr>
         <w:pStyle w:val="Heading2"/>
@@ -15067,9 +15078,9 @@
         <w:t xml:space="preserve">: None. The analysis reported here follows the pre-registered protocol without post-hoc filter adjustment. The n = 43 unfiltered cohort is reported as a sensitivity check in Appendix C.1 rather than as the primary analysis. A secondary n = 30 top-quality-filter cohort (not pre-registered) is noted in Appendix C.2 for completeness but is not used for any reported headline claim; the Persona-vs-humanized Fisher’s p = 0.036 finding that would emerge only under the n = 30 filter is reported transparently as filter-dependent and not claimed as a primary result.</w:t>
       </w:r>
     </w:p>
-    <w:bookmarkEnd w:id="87"/>
     <w:bookmarkEnd w:id="88"/>
-    <w:bookmarkStart w:id="100" w:name="appendix-a-metric-definitions"/>
+    <w:bookmarkEnd w:id="89"/>
+    <w:bookmarkStart w:id="101" w:name="appendix-a-metric-definitions"/>
     <w:p>
       <w:pPr>
         <w:pStyle w:val="Heading1"/>
@@ -15194,7 +15205,7 @@
         <w:t xml:space="preserve">. Per-1k rates are computed as (count × 1000) / word_count. All source code is released in the paper’s companion repository.</w:t>
       </w:r>
     </w:p>
-    <w:bookmarkStart w:id="94" w:name="a.1-linguistic-battery-22-metrics"/>
+    <w:bookmarkStart w:id="95" w:name="a.1-linguistic-battery-22-metrics"/>
     <w:p>
       <w:pPr>
         <w:pStyle w:val="Heading2"/>
@@ -15212,7 +15223,7 @@
         <w:t xml:space="preserve">A.1 Linguistic battery (22 metrics)</w:t>
       </w:r>
     </w:p>
-    <w:bookmarkStart w:id="89" w:name="voice-and-person-4-metrics"/>
+    <w:bookmarkStart w:id="90" w:name="voice-and-person-4-metrics"/>
     <w:p>
       <w:pPr>
         <w:pStyle w:val="Heading3"/>
@@ -15354,8 +15365,8 @@
         <w:t xml:space="preserve">): count of apostrophe-containing clitic contractions (’s, n’t, ’ll, ’ve, ’re, ’d, ’m), normalized to per-1000-word rate.</w:t>
       </w:r>
     </w:p>
-    <w:bookmarkEnd w:id="89"/>
-    <w:bookmarkStart w:id="90" w:name="readability-and-structure-5-metrics"/>
+    <w:bookmarkEnd w:id="90"/>
+    <w:bookmarkStart w:id="91" w:name="readability-and-structure-5-metrics"/>
     <w:p>
       <w:pPr>
         <w:pStyle w:val="Heading3"/>
@@ -15504,8 +15515,8 @@
         <w:t xml:space="preserve">): fraction of sentences with more than 35 tokens, expressed as a percentage.</w:t>
       </w:r>
     </w:p>
-    <w:bookmarkEnd w:id="90"/>
-    <w:bookmarkStart w:id="91" w:name="lexical-diversity-3-metrics"/>
+    <w:bookmarkEnd w:id="91"/>
+    <w:bookmarkStart w:id="92" w:name="lexical-diversity-3-metrics"/>
     <w:p>
       <w:pPr>
         <w:pStyle w:val="Heading3"/>
@@ -15604,8 +15615,8 @@
         <w:t xml:space="preserve">: fraction of word types that appear exactly once in the sample. Computed as count of hapaxes divided by vocabulary size (unique types).</w:t>
       </w:r>
     </w:p>
-    <w:bookmarkEnd w:id="91"/>
-    <w:bookmarkStart w:id="92" w:name="discourse-markers-5-metrics"/>
+    <w:bookmarkEnd w:id="92"/>
+    <w:bookmarkStart w:id="93" w:name="discourse-markers-5-metrics"/>
     <w:p>
       <w:pPr>
         <w:pStyle w:val="Heading3"/>
@@ -15811,8 +15822,8 @@
         <w:t xml:space="preserve">): count of quotation-mark pairs (straight or curly), normalized to per-1000-word rate.</w:t>
       </w:r>
     </w:p>
-    <w:bookmarkEnd w:id="92"/>
-    <w:bookmarkStart w:id="93" w:name="quality-signals-5-metrics"/>
+    <w:bookmarkEnd w:id="93"/>
+    <w:bookmarkStart w:id="94" w:name="quality-signals-5-metrics"/>
     <w:p>
       <w:pPr>
         <w:pStyle w:val="Heading3"/>
@@ -16144,9 +16155,9 @@
         <w:t xml:space="preserve">), normalized to per-1000-word rate. A subcomponent of metric 18 that we break out separately because it is the single strongest phrase-level discriminator in the literature (Pangram reports these phrases appear 70–700× more often in LLM outputs than in human text).</w:t>
       </w:r>
     </w:p>
-    <w:bookmarkEnd w:id="93"/>
     <w:bookmarkEnd w:id="94"/>
-    <w:bookmarkStart w:id="99" w:name="X0fb5a5d9b782f88b004f12431419790e3ed2bae"/>
+    <w:bookmarkEnd w:id="95"/>
+    <w:bookmarkStart w:id="100" w:name="X0fb5a5d9b782f88b004f12431419790e3ed2bae"/>
     <w:p>
       <w:pPr>
         <w:pStyle w:val="Heading2"/>
@@ -16187,7 +16198,7 @@
         <w:t xml:space="preserve">(Reimers and Gurevych, 2019). Each sentence is encoded to a 768-dim unit vector; metrics below are computed on those vectors.</w:t>
       </w:r>
     </w:p>
-    <w:bookmarkStart w:id="95" w:name="redundancy-2-metrics"/>
+    <w:bookmarkStart w:id="96" w:name="redundancy-2-metrics"/>
     <w:p>
       <w:pPr>
         <w:pStyle w:val="Heading3"/>
@@ -16267,8 +16278,8 @@
         <w:t xml:space="preserve">): maximum pairwise cosine similarity across all sentence pairs. Captures the strongest single repetition in the text.</w:t>
       </w:r>
     </w:p>
-    <w:bookmarkEnd w:id="95"/>
-    <w:bookmarkStart w:id="96" w:name="consecutive-similarity-2-metrics"/>
+    <w:bookmarkEnd w:id="96"/>
+    <w:bookmarkStart w:id="97" w:name="consecutive-similarity-2-metrics"/>
     <w:p>
       <w:pPr>
         <w:pStyle w:val="Heading3"/>
@@ -16377,8 +16388,8 @@
         <w:t xml:space="preserve">): standard deviation of adjacent-pair cosine similarity. Human writing exhibits higher std (topic shifts, asides); AI text tends toward lower std (uniform flow).</w:t>
       </w:r>
     </w:p>
-    <w:bookmarkEnd w:id="96"/>
-    <w:bookmarkStart w:id="97" w:name="content-diversity-variance-1-metric"/>
+    <w:bookmarkEnd w:id="97"/>
+    <w:bookmarkStart w:id="98" w:name="content-diversity-variance-1-metric"/>
     <w:p>
       <w:pPr>
         <w:pStyle w:val="Heading3"/>
@@ -16427,8 +16438,8 @@
         <w:t xml:space="preserve">): per-paragraph content diversity, computed as the mean pairwise Euclidean distance between sentence embeddings within a paragraph, then the variance of that mean across paragraphs. Human writing tends to show higher density variance (technical paragraphs alternate with narrative ones); aligned AI pipelines converge on lower variance. The strongest single linguistic discriminator between AI and human writing in our corpus (§5.2).</w:t>
       </w:r>
     </w:p>
-    <w:bookmarkEnd w:id="97"/>
-    <w:bookmarkStart w:id="98" w:name="embedding-transition-variance-1-metric"/>
+    <w:bookmarkEnd w:id="98"/>
+    <w:bookmarkStart w:id="99" w:name="embedding-transition-variance-1-metric"/>
     <w:p>
       <w:pPr>
         <w:pStyle w:val="Heading3"/>
@@ -16477,10 +16488,10 @@
         <w:t xml:space="preserve">): variance of the Euclidean distance between consecutive sentence embeddings. High variance indicates a mixture of predictable transitions and surprising topic shifts, characteristic of human writing.</w:t>
       </w:r>
     </w:p>
-    <w:bookmarkEnd w:id="98"/>
     <w:bookmarkEnd w:id="99"/>
     <w:bookmarkEnd w:id="100"/>
-    <w:bookmarkStart w:id="108" w:name="appendix-b-human-evaluation-instrument"/>
+    <w:bookmarkEnd w:id="101"/>
+    <w:bookmarkStart w:id="109" w:name="appendix-b-human-evaluation-instrument"/>
     <w:p>
       <w:pPr>
         <w:pStyle w:val="Heading1"/>
@@ -16560,7 +16571,7 @@
         <w:t xml:space="preserve">handles API endpoints and response storage).</w:t>
       </w:r>
     </w:p>
-    <w:bookmarkStart w:id="101" w:name="b.1-survey-flow"/>
+    <w:bookmarkStart w:id="102" w:name="b.1-survey-flow"/>
     <w:p>
       <w:pPr>
         <w:pStyle w:val="Heading2"/>
@@ -16736,8 +16747,8 @@
         <w:t xml:space="preserve">— Prolific completion code + submission confirmation.</w:t>
       </w:r>
     </w:p>
-    <w:bookmarkEnd w:id="101"/>
-    <w:bookmarkStart w:id="102" w:name="b.2-passage-selection"/>
+    <w:bookmarkEnd w:id="102"/>
+    <w:bookmarkStart w:id="103" w:name="b.2-passage-selection"/>
     <w:p>
       <w:pPr>
         <w:pStyle w:val="Heading2"/>
@@ -17239,8 +17250,8 @@
         <w:t xml:space="preserve">Passages were truncated to approximately 800 words each (range 720–910) at natural section boundaries. Passage C and Passage H share a topic (idempotency keys) at opposite ends of the pipeline; Passage D and Passage E share a topic (exponential backoff) across the human-vs-AI axis at the final pipeline stage. All three human baselines were selected to predate widespread LLM adoption (2015–2017 publication dates) to minimize detector cache-pollution risk (see the feedback rule in our public release on AI detector retrieval-not-classification behavior).</w:t>
       </w:r>
     </w:p>
-    <w:bookmarkEnd w:id="102"/>
-    <w:bookmarkStart w:id="103" w:name="b.3-per-passage-questions"/>
+    <w:bookmarkEnd w:id="103"/>
+    <w:bookmarkStart w:id="104" w:name="b.3-per-passage-questions"/>
     <w:p>
       <w:pPr>
         <w:pStyle w:val="Heading2"/>
@@ -17570,8 +17581,8 @@
         <w:t xml:space="preserve">The six Likert items (Q2–Q7) compose the Likert battery used for composite quality (Q3–Q5, Q7 averaged) and per-dimension tests (§5.5.4). Q1 provides the binary classification analyzed in §5.5.1–5.5.3. Q8 free-text responses are thematically coded for the reader-cited-features analysis (§5.5.5).</w:t>
       </w:r>
     </w:p>
-    <w:bookmarkEnd w:id="103"/>
-    <w:bookmarkStart w:id="104" w:name="b.4-randomization"/>
+    <w:bookmarkEnd w:id="104"/>
+    <w:bookmarkStart w:id="105" w:name="b.4-randomization"/>
     <w:p>
       <w:pPr>
         <w:pStyle w:val="Heading2"/>
@@ -17612,8 +17623,8 @@
         <w:t xml:space="preserve">at session start. Within each passage page, question order is fixed (Q1–Q8) across participants. No per-participant randomization of Likert anchor order or polarity was applied; all scales are oriented so that 5 is the more favorable pole.</w:t>
       </w:r>
     </w:p>
-    <w:bookmarkEnd w:id="104"/>
-    <w:bookmarkStart w:id="105" w:name="b.5-attention-checks-and-exclusion"/>
+    <w:bookmarkEnd w:id="105"/>
+    <w:bookmarkStart w:id="106" w:name="b.5-attention-checks-and-exclusion"/>
     <w:p>
       <w:pPr>
         <w:pStyle w:val="Heading2"/>
@@ -17672,8 +17683,8 @@
         <w:t xml:space="preserve">gear rather than reading for comprehension — are excluded from the primary analysis. Ten of 43 participants met this criterion; the retained n = 33 cohort is the primary analysis sample. The unfiltered n = 43 cohort is reported as a sensitivity check in Appendix C.1.</w:t>
       </w:r>
     </w:p>
-    <w:bookmarkEnd w:id="105"/>
-    <w:bookmarkStart w:id="106" w:name="b.6-debrief"/>
+    <w:bookmarkEnd w:id="106"/>
+    <w:bookmarkStart w:id="107" w:name="b.6-debrief"/>
     <w:p>
       <w:pPr>
         <w:pStyle w:val="Heading2"/>
@@ -17821,8 +17832,8 @@
         <w:t xml:space="preserve">question analyzed in §5.5.4 binds readers to one choice among the five AI passages and is used to test the aggregate preference reported there (16 of 33 = 48.5% selecting an AI passage, p = 0.107 below a 62.5% base rate).</w:t>
       </w:r>
     </w:p>
-    <w:bookmarkEnd w:id="106"/>
-    <w:bookmarkStart w:id="107" w:name="b.7-compensation-and-participant-flow"/>
+    <w:bookmarkEnd w:id="107"/>
+    <w:bookmarkStart w:id="108" w:name="b.7-compensation-and-participant-flow"/>
     <w:p>
       <w:pPr>
         <w:pStyle w:val="Heading2"/>
@@ -17863,9 +17874,9 @@
         <w:t xml:space="preserve">with Prolific PIDs replaced by randomized session identifiers.</w:t>
       </w:r>
     </w:p>
-    <w:bookmarkEnd w:id="107"/>
     <w:bookmarkEnd w:id="108"/>
-    <w:bookmarkStart w:id="111" w:name="appendix-c-sensitivity-analyses"/>
+    <w:bookmarkEnd w:id="109"/>
+    <w:bookmarkStart w:id="112" w:name="appendix-c-sensitivity-analyses"/>
     <w:p>
       <w:pPr>
         <w:pStyle w:val="Heading1"/>
@@ -17883,7 +17894,7 @@
         <w:t xml:space="preserve">Appendix C: Sensitivity Analyses</w:t>
       </w:r>
     </w:p>
-    <w:bookmarkStart w:id="109" w:name="Xc6082b805ac413a467f9e79b793cc6deb94e590"/>
+    <w:bookmarkStart w:id="110" w:name="Xc6082b805ac413a467f9e79b793cc6deb94e590"/>
     <w:p>
       <w:pPr>
         <w:pStyle w:val="Heading2"/>
@@ -18562,8 +18573,8 @@
         <w:t xml:space="preserve">) holds under either filter.</w:t>
       </w:r>
     </w:p>
-    <w:bookmarkEnd w:id="109"/>
-    <w:bookmarkStart w:id="110" w:name="X32369f3ea4630cad2ccf4484c0f66f94f7adcd3"/>
+    <w:bookmarkEnd w:id="110"/>
+    <w:bookmarkStart w:id="111" w:name="X32369f3ea4630cad2ccf4484c0f66f94f7adcd3"/>
     <w:p>
       <w:pPr>
         <w:pStyle w:val="Heading2"/>
@@ -18589,9 +18600,9 @@
         <w:t xml:space="preserve">For completeness we also report results on the top 30 responses by a composite quality score combining total duration, per-passage reading time, Likert variance, reasoning engagement, and origin-guess variety. This is a post-hoc, not pre-registered, filter. All primary effects again hold in direction and significance level; the Copyleaks-ρ anti-correlation on AI passages reaches ρ = −0.92 (p = 0.026) under this stricter filter, providing the strongest signal for the machine-crowd disagreement result. We report the pre-registered n = 33 analysis as primary to avoid any appearance of filter selection after observing the effects; the top-30 cohort is reported here as secondary evidence that the direction of findings is robust to filter choice.</w:t>
       </w:r>
     </w:p>
-    <w:bookmarkEnd w:id="110"/>
     <w:bookmarkEnd w:id="111"/>
-    <w:bookmarkStart w:id="116" w:name="appendix-d-glossary"/>
+    <w:bookmarkEnd w:id="112"/>
+    <w:bookmarkStart w:id="117" w:name="appendix-d-glossary"/>
     <w:p>
       <w:pPr>
         <w:pStyle w:val="Heading1"/>
@@ -18617,7 +18628,7 @@
         <w:t xml:space="preserve">Terms are grouped by scope; entries cover paper-specific usage rather than re-deriving well-known definitions.</w:t>
       </w:r>
     </w:p>
-    <w:bookmarkStart w:id="112" w:name="d.1-corpus-and-pipeline"/>
+    <w:bookmarkStart w:id="113" w:name="d.1-corpus-and-pipeline"/>
     <w:p>
       <w:pPr>
         <w:pStyle w:val="Heading2"/>
@@ -18835,8 +18846,8 @@
         <w:t xml:space="preserve">: Dana → surgical v10.2 → cross-model v2, applied in order. We also report each stage as a standalone sample group for ablation.</w:t>
       </w:r>
     </w:p>
-    <w:bookmarkEnd w:id="112"/>
-    <w:bookmarkStart w:id="113" w:name="d.2-measurement-framework"/>
+    <w:bookmarkEnd w:id="113"/>
+    <w:bookmarkStart w:id="114" w:name="d.2-measurement-framework"/>
     <w:p>
       <w:pPr>
         <w:pStyle w:val="Heading2"/>
@@ -19023,8 +19034,8 @@
         <w:t xml:space="preserve">): a detector’s response to the characteristic token-selection pattern that arises from LLM text generation, independent of surface linguistic statistics. Binoculars responds to this signal most directly (via a perplexity ratio between a base and instruction-tuned LM); GPTZero and Copyleaks weight it significantly as part of hybrid approaches. Defeating it requires disrupting the single-model distribution, which cross-model v2 sentence mixing does.</w:t>
       </w:r>
     </w:p>
-    <w:bookmarkEnd w:id="113"/>
-    <w:bookmarkStart w:id="114" w:name="d.3-reader-evaluation"/>
+    <w:bookmarkEnd w:id="114"/>
+    <w:bookmarkStart w:id="115" w:name="d.3-reader-evaluation"/>
     <w:p>
       <w:pPr>
         <w:pStyle w:val="Heading2"/>
@@ -19210,8 +19221,8 @@
         <w:t xml:space="preserve">: linguistic-feature densities that exceed human-corpus norms. At the Passage-H level, first-person singular reaches 19.20/1k — 4.5× the human corpus mean (4.26/1k), 2.0× the corpus-level human maximum (Srivastav 9.39/1k), and 3.6× the highest of the three human baselines in the survey (Olah 5.38/1k). At the Dana group level, the average FPS is 16.68/1k, ≈ 4× the human corpus mean; contractions average 27.14/1k, 2.4× the human corpus mean. §5.5.8 shows readers rate supra-human densities higher in quality than human-normal densities.</w:t>
       </w:r>
     </w:p>
-    <w:bookmarkEnd w:id="114"/>
-    <w:bookmarkStart w:id="115" w:name="d.4-statistical-conventions"/>
+    <w:bookmarkEnd w:id="115"/>
+    <w:bookmarkStart w:id="116" w:name="d.4-statistical-conventions"/>
     <w:p>
       <w:pPr>
         <w:pStyle w:val="Heading2"/>
@@ -19339,9 +19350,9 @@
         <w:t xml:space="preserve">: the primary-analysis cohort after applying the reading-rate exclusion. Unfiltered n = 43 is reported as a sensitivity check (Appendix C.1); post-hoc top-30 quality-filtered results appear in Appendix C.2.</w:t>
       </w:r>
     </w:p>
-    <w:bookmarkEnd w:id="115"/>
     <w:bookmarkEnd w:id="116"/>
-    <w:bookmarkStart w:id="121" w:name="appendix-e-reproducibility-checklist"/>
+    <w:bookmarkEnd w:id="117"/>
+    <w:bookmarkStart w:id="122" w:name="appendix-e-reproducibility-checklist"/>
     <w:p>
       <w:pPr>
         <w:pStyle w:val="Heading1"/>
@@ -19367,7 +19378,7 @@
         <w:t xml:space="preserve">This checklist follows the ACL Responsible NLP Checklist categories. Section references point to the authoritative source for each item within this paper.</w:t>
       </w:r>
     </w:p>
-    <w:bookmarkStart w:id="117" w:name="e.1-every-submission"/>
+    <w:bookmarkStart w:id="118" w:name="e.1-every-submission"/>
     <w:p>
       <w:pPr>
         <w:pStyle w:val="Heading2"/>
@@ -19487,8 +19498,8 @@
         <w:t xml:space="preserve">(Declarations).</w:t>
       </w:r>
     </w:p>
-    <w:bookmarkEnd w:id="117"/>
-    <w:bookmarkStart w:id="118" w:name="e.2-artifacts-used-or-created"/>
+    <w:bookmarkEnd w:id="118"/>
+    <w:bookmarkStart w:id="119" w:name="e.2-artifacts-used-or-created"/>
     <w:p>
       <w:pPr>
         <w:pStyle w:val="Heading2"/>
@@ -19770,8 +19781,8 @@
         <w:t xml:space="preserve">, Declarations).</w:t>
       </w:r>
     </w:p>
-    <w:bookmarkEnd w:id="118"/>
-    <w:bookmarkStart w:id="119" w:name="e.3-computational-experiments"/>
+    <w:bookmarkEnd w:id="119"/>
+    <w:bookmarkStart w:id="120" w:name="e.3-computational-experiments"/>
     <w:p>
       <w:pPr>
         <w:pStyle w:val="Heading2"/>
@@ -19933,8 +19944,8 @@
         <w:t xml:space="preserve">— All reported point estimates include confidence intervals or p-values where applicable; per-dimension Likert contrasts are corrected for multiple comparisons via Benjamini–Hochberg FDR (§5.5.4, Appendix D.4).</w:t>
       </w:r>
     </w:p>
-    <w:bookmarkEnd w:id="119"/>
-    <w:bookmarkStart w:id="120" w:name="e.4-human-subjects"/>
+    <w:bookmarkEnd w:id="120"/>
+    <w:bookmarkStart w:id="121" w:name="e.4-human-subjects"/>
     <w:p>
       <w:pPr>
         <w:pStyle w:val="Heading2"/>
@@ -20128,8 +20139,8 @@
         <w:t xml:space="preserve">, Declarations). Moderator analyses by demographic stratum are flagged as underpowered at n = 33 (§6.4 Limitations).</w:t>
       </w:r>
     </w:p>
-    <w:bookmarkEnd w:id="120"/>
     <w:bookmarkEnd w:id="121"/>
+    <w:bookmarkEnd w:id="122"/>
     <w:sectPr/>
   </w:body>
 </w:document>

</xml_diff>